<commit_message>
Add profile photo to hero, wire up GitHub link, update certification
- Hero section now shows a headshot beside the name/title on desktop,
  stacked above on mobile
- GitHub profile link added to Contact section and footer
- Certification entry updated with exam code
- Refreshed resume file
</commit_message>
<xml_diff>
--- a/static/resume/Pavan_Gadireddy_Resume.docx
+++ b/static/resume/Pavan_Gadireddy_Resume.docx
@@ -4370,45 +4370,75 @@
           <w:rFonts w:ascii="Times New Roman" w:cs="Times New Roman" w:eastAsia="Times New Roman" w:hAnsi="Times New Roman"/>
           <w:b w:val="1"/>
           <w:bCs w:val="1"/>
-          <w:color w:val="ffffff"/>
-          <w:sz w:val="20"/>
-          <w:szCs w:val="20"/>
-          <w:highlight w:val="white"/>
-        </w:rPr>
-      </w:pPr>
-      <w:r>
-        <w:rPr>
-          <w:rFonts w:ascii="Times New Roman" w:cs="Times New Roman" w:eastAsia="Times New Roman" w:hAnsi="Times New Roman"/>
-          <w:b w:val="1"/>
-          <w:bCs w:val="1"/>
-          <w:color w:val="ffffff"/>
-          <w:sz w:val="20"/>
-          <w:szCs w:val="20"/>
-          <w:highlight w:val="white"/>
-          <w:rtl w:val="0"/>
-        </w:rPr>
-        <w:t xml:space="preserve">Azure Fundamentals - Microsoft (In Progress)</w:t>
-      </w:r>
-    </w:p>
-    <w:p>
-      <w:pPr>
-        <w:spacing w:line="240" w:lineRule="auto"/>
+          <w:sz w:val="20"/>
+          <w:szCs w:val="20"/>
+        </w:rPr>
+      </w:pPr>
+      <w:r>
+        <w:rPr>
+          <w:rFonts w:ascii="Times New Roman" w:cs="Times New Roman" w:eastAsia="Times New Roman" w:hAnsi="Times New Roman"/>
+          <w:b w:val="1"/>
+          <w:bCs w:val="1"/>
+          <w:sz w:val="20"/>
+          <w:szCs w:val="20"/>
+          <w:rtl w:val="0"/>
+        </w:rPr>
+        <w:t xml:space="preserve">Claude Code 101 - Anthropic | </w:t>
+      </w:r>
+      <w:hyperlink r:id="rId10">
+        <w:r>
+          <w:rPr>
+            <w:rFonts w:ascii="Times New Roman" w:cs="Times New Roman" w:eastAsia="Times New Roman" w:hAnsi="Times New Roman"/>
+            <w:b w:val="1"/>
+            <w:bCs w:val="1"/>
+            <w:color w:val="1155cc"/>
+            <w:sz w:val="20"/>
+            <w:szCs w:val="20"/>
+            <w:u w:val="single"/>
+            <w:rtl w:val="0"/>
+          </w:rPr>
+          <w:t xml:space="preserve">LINK</w:t>
+        </w:r>
+      </w:hyperlink>
+      <w:r>
+        <w:rPr>
+          <w:rtl w:val="0"/>
+        </w:rPr>
+      </w:r>
+    </w:p>
+    <w:p>
+      <w:pPr>
         <w:jc w:val="both"/>
         <w:rPr>
           <w:rFonts w:ascii="Times New Roman" w:cs="Times New Roman" w:eastAsia="Times New Roman" w:hAnsi="Times New Roman"/>
-          <w:sz w:val="20"/>
-          <w:szCs w:val="20"/>
-        </w:rPr>
-      </w:pPr>
-      <w:r>
-        <w:rPr>
-          <w:rtl w:val="0"/>
-        </w:rPr>
-      </w:r>
-    </w:p>
-    <w:p>
-      <w:pPr>
-        <w:rPr/>
+          <w:b w:val="1"/>
+          <w:bCs w:val="1"/>
+          <w:sz w:val="20"/>
+          <w:szCs w:val="20"/>
+        </w:rPr>
+      </w:pPr>
+      <w:r>
+        <w:rPr>
+          <w:rFonts w:ascii="Times New Roman" w:cs="Times New Roman" w:eastAsia="Times New Roman" w:hAnsi="Times New Roman"/>
+          <w:b w:val="1"/>
+          <w:bCs w:val="1"/>
+          <w:sz w:val="20"/>
+          <w:szCs w:val="20"/>
+          <w:rtl w:val="0"/>
+        </w:rPr>
+        <w:t xml:space="preserve">Microsoft Certified: Azure Databricks Data Engineer Associate - DP750 | In progress</w:t>
+      </w:r>
+    </w:p>
+    <w:p>
+      <w:pPr>
+        <w:jc w:val="both"/>
+        <w:rPr>
+          <w:rFonts w:ascii="Times New Roman" w:cs="Times New Roman" w:eastAsia="Times New Roman" w:hAnsi="Times New Roman"/>
+          <w:b w:val="1"/>
+          <w:bCs w:val="1"/>
+          <w:sz w:val="20"/>
+          <w:szCs w:val="20"/>
+        </w:rPr>
       </w:pPr>
       <w:r>
         <w:rPr>

</xml_diff>